<commit_message>
paper: add Table 4 — biosafety gate results for 7M5T demo submission
Inserts a six-column summary table after the Section 4.3 gate result
paragraphs, covering gates α–δ with question answered, key metrics,
actual values, thresholds/interpretation, and verdict. Gate δ clearly
marked PENDING (pre-production).

https://claude.ai/code/session_01E7HryiScK5iRY9dxXKUJWQ
</commit_message>
<xml_diff>
--- a/paper/ArtGene_Archive_bioRxiv_REVISED.docx
+++ b/paper/ArtGene_Archive_bioRxiv_REVISED.docx
@@ -6396,6 +6396,483 @@
         </w:rPr>
       </w:r>
     </w:p>
+    <w:p>
+      <w:r>
+        <w:rPr>
+          <w:i/>
+          <w:sz w:val="18"/>
+        </w:rPr>
+        <w:t>Table 4. Biosafety gate results for the demonstration submission (PDB 7M5T, de novo hallucinated protein 0515, Anishchenko et al. [30]). HGT = horizontal gene transfer propensity; GRAVY = grand average of hydropathicity; CAI = codon adaptation index; pLDDT = predicted local distance difference test.</w:t>
+      </w:r>
+    </w:p>
+    <w:tbl>
+      <w:tblPr>
+        <w:tblW w:type="auto" w:w="0"/>
+        <w:tblLook w:firstColumn="1" w:firstRow="1" w:lastColumn="0" w:lastRow="0" w:noHBand="0" w:noVBand="1" w:val="04A0"/>
+        <w:tblBorders>
+          <w:top w:val="single" w:sz="4" w:space="0" w:color="999999"/>
+          <w:left w:val="single" w:sz="4" w:space="0" w:color="999999"/>
+          <w:bottom w:val="single" w:sz="4" w:space="0" w:color="999999"/>
+          <w:right w:val="single" w:sz="4" w:space="0" w:color="999999"/>
+          <w:insideH w:val="single" w:sz="4" w:space="0" w:color="999999"/>
+          <w:insideV w:val="single" w:sz="4" w:space="0" w:color="999999"/>
+        </w:tblBorders>
+      </w:tblPr>
+      <w:tblGrid>
+        <w:gridCol w:w="1560"/>
+        <w:gridCol w:w="1560"/>
+        <w:gridCol w:w="1560"/>
+        <w:gridCol w:w="1560"/>
+        <w:gridCol w:w="1560"/>
+        <w:gridCol w:w="1560"/>
+      </w:tblGrid>
+      <w:tr>
+        <w:tc>
+          <w:tcPr>
+            <w:tcW w:type="dxa" w:w="1560"/>
+            <w:shd w:val="clear" w:color="auto" w:fill="D9E1F2"/>
+          </w:tcPr>
+          <w:p>
+            <w:r>
+              <w:rPr>
+                <w:b/>
+                <w:sz w:val="18"/>
+              </w:rPr>
+              <w:t>Gate</w:t>
+            </w:r>
+          </w:p>
+        </w:tc>
+        <w:tc>
+          <w:tcPr>
+            <w:tcW w:type="dxa" w:w="1560"/>
+            <w:shd w:val="clear" w:color="auto" w:fill="D9E1F2"/>
+          </w:tcPr>
+          <w:p>
+            <w:r>
+              <w:rPr>
+                <w:b/>
+                <w:sz w:val="18"/>
+              </w:rPr>
+              <w:t>Question answered</w:t>
+            </w:r>
+          </w:p>
+        </w:tc>
+        <w:tc>
+          <w:tcPr>
+            <w:tcW w:type="dxa" w:w="1560"/>
+            <w:shd w:val="clear" w:color="auto" w:fill="D9E1F2"/>
+          </w:tcPr>
+          <w:p>
+            <w:r>
+              <w:rPr>
+                <w:b/>
+                <w:sz w:val="18"/>
+              </w:rPr>
+              <w:t>Key metric(s)</w:t>
+            </w:r>
+          </w:p>
+        </w:tc>
+        <w:tc>
+          <w:tcPr>
+            <w:tcW w:type="dxa" w:w="1560"/>
+            <w:shd w:val="clear" w:color="auto" w:fill="D9E1F2"/>
+          </w:tcPr>
+          <w:p>
+            <w:r>
+              <w:rPr>
+                <w:b/>
+                <w:sz w:val="18"/>
+              </w:rPr>
+              <w:t>Value</w:t>
+              <w:br/>
+              <w:t>(7M5T demo)</w:t>
+            </w:r>
+          </w:p>
+        </w:tc>
+        <w:tc>
+          <w:tcPr>
+            <w:tcW w:type="dxa" w:w="1560"/>
+            <w:shd w:val="clear" w:color="auto" w:fill="D9E1F2"/>
+          </w:tcPr>
+          <w:p>
+            <w:r>
+              <w:rPr>
+                <w:b/>
+                <w:sz w:val="18"/>
+              </w:rPr>
+              <w:t>Threshold / interpretation</w:t>
+            </w:r>
+          </w:p>
+        </w:tc>
+        <w:tc>
+          <w:tcPr>
+            <w:tcW w:type="dxa" w:w="1560"/>
+            <w:shd w:val="clear" w:color="auto" w:fill="D9E1F2"/>
+          </w:tcPr>
+          <w:p>
+            <w:r>
+              <w:rPr>
+                <w:b/>
+                <w:sz w:val="18"/>
+              </w:rPr>
+              <w:t>Verdict</w:t>
+            </w:r>
+          </w:p>
+        </w:tc>
+      </w:tr>
+      <w:tr>
+        <w:tc>
+          <w:tcPr>
+            <w:tcW w:type="dxa" w:w="1560"/>
+            <w:shd w:val="clear" w:color="auto" w:fill="F2F2F2"/>
+          </w:tcPr>
+          <w:p>
+            <w:r>
+              <w:rPr>
+                <w:b/>
+                <w:sz w:val="18"/>
+              </w:rPr>
+              <w:t>α — Structural confidence</w:t>
+            </w:r>
+          </w:p>
+        </w:tc>
+        <w:tc>
+          <w:tcPr>
+            <w:tcW w:type="dxa" w:w="1560"/>
+          </w:tcPr>
+          <w:p>
+            <w:r>
+              <w:rPr>
+                <w:b w:val="0"/>
+                <w:sz w:val="18"/>
+              </w:rPr>
+              <w:t>Does the protein fold into a stable 3D structure?</w:t>
+            </w:r>
+          </w:p>
+        </w:tc>
+        <w:tc>
+          <w:tcPr>
+            <w:tcW w:type="dxa" w:w="1560"/>
+          </w:tcPr>
+          <w:p>
+            <w:r>
+              <w:rPr>
+                <w:b w:val="0"/>
+                <w:sz w:val="18"/>
+              </w:rPr>
+              <w:t>ESMFold pLDDT mean; fraction of residues pLDDT &lt; 50</w:t>
+            </w:r>
+          </w:p>
+        </w:tc>
+        <w:tc>
+          <w:tcPr>
+            <w:tcW w:type="dxa" w:w="1560"/>
+          </w:tcPr>
+          <w:p>
+            <w:r>
+              <w:rPr>
+                <w:b w:val="0"/>
+                <w:sz w:val="18"/>
+              </w:rPr>
+              <w:t>Mean 77.6; 0.0% below pLDDT 50</w:t>
+            </w:r>
+          </w:p>
+        </w:tc>
+        <w:tc>
+          <w:tcPr>
+            <w:tcW w:type="dxa" w:w="1560"/>
+          </w:tcPr>
+          <w:p>
+            <w:r>
+              <w:rPr>
+                <w:b w:val="0"/>
+                <w:sz w:val="18"/>
+              </w:rPr>
+              <w:t>FAIL if &gt; 20% residues below pLDDT 50. Score of 77.6 is good confidence; 0% disordered residues.</w:t>
+            </w:r>
+          </w:p>
+        </w:tc>
+        <w:tc>
+          <w:tcPr>
+            <w:tcW w:type="dxa" w:w="1560"/>
+            <w:shd w:val="clear" w:color="auto" w:fill="E2EFDA"/>
+          </w:tcPr>
+          <w:p>
+            <w:r>
+              <w:rPr>
+                <w:b/>
+                <w:sz w:val="18"/>
+              </w:rPr>
+              <w:t>PASS</w:t>
+            </w:r>
+          </w:p>
+        </w:tc>
+      </w:tr>
+      <w:tr>
+        <w:tc>
+          <w:tcPr>
+            <w:tcW w:type="dxa" w:w="1560"/>
+            <w:shd w:val="clear" w:color="auto" w:fill="F2F2F2"/>
+          </w:tcPr>
+          <w:p>
+            <w:r>
+              <w:rPr>
+                <w:b/>
+                <w:sz w:val="18"/>
+              </w:rPr>
+              <w:t>β — Off-target &amp; composition</w:t>
+            </w:r>
+          </w:p>
+        </w:tc>
+        <w:tc>
+          <w:tcPr>
+            <w:tcW w:type="dxa" w:w="1560"/>
+          </w:tcPr>
+          <w:p>
+            <w:r>
+              <w:rPr>
+                <w:b w:val="0"/>
+                <w:sz w:val="18"/>
+              </w:rPr>
+              <w:t>Could the protein harm a human (toxin or allergen)?</w:t>
+            </w:r>
+          </w:p>
+        </w:tc>
+        <w:tc>
+          <w:tcPr>
+            <w:tcW w:type="dxa" w:w="1560"/>
+          </w:tcPr>
+          <w:p>
+            <w:r>
+              <w:rPr>
+                <w:b w:val="0"/>
+                <w:sz w:val="18"/>
+              </w:rPr>
+              <w:t>GRAVY hydropathy; cationic toxin probability; allergen probability</w:t>
+            </w:r>
+          </w:p>
+        </w:tc>
+        <w:tc>
+          <w:tcPr>
+            <w:tcW w:type="dxa" w:w="1560"/>
+          </w:tcPr>
+          <w:p>
+            <w:r>
+              <w:rPr>
+                <w:b w:val="0"/>
+                <w:sz w:val="18"/>
+              </w:rPr>
+              <w:t>GRAVY −0.667; toxin prob 0.130; allergen prob 0.000</w:t>
+            </w:r>
+          </w:p>
+        </w:tc>
+        <w:tc>
+          <w:tcPr>
+            <w:tcW w:type="dxa" w:w="1560"/>
+          </w:tcPr>
+          <w:p>
+            <w:r>
+              <w:rPr>
+                <w:b w:val="0"/>
+                <w:sz w:val="18"/>
+              </w:rPr>
+              <w:t>GRAVY &lt; 0 = hydrophilic (not membrane-disrupting). Toxin threshold &lt; 0.30; allergen threshold &lt; 0.40. All within safe limits.</w:t>
+            </w:r>
+          </w:p>
+        </w:tc>
+        <w:tc>
+          <w:tcPr>
+            <w:tcW w:type="dxa" w:w="1560"/>
+            <w:shd w:val="clear" w:color="auto" w:fill="E2EFDA"/>
+          </w:tcPr>
+          <w:p>
+            <w:r>
+              <w:rPr>
+                <w:b/>
+                <w:sz w:val="18"/>
+              </w:rPr>
+              <w:t>PASS</w:t>
+            </w:r>
+          </w:p>
+        </w:tc>
+      </w:tr>
+      <w:tr>
+        <w:tc>
+          <w:tcPr>
+            <w:tcW w:type="dxa" w:w="1560"/>
+            <w:shd w:val="clear" w:color="auto" w:fill="F2F2F2"/>
+          </w:tcPr>
+          <w:p>
+            <w:r>
+              <w:rPr>
+                <w:b/>
+                <w:sz w:val="18"/>
+              </w:rPr>
+              <w:t>γ — Ecological risk</w:t>
+            </w:r>
+          </w:p>
+        </w:tc>
+        <w:tc>
+          <w:tcPr>
+            <w:tcW w:type="dxa" w:w="1560"/>
+          </w:tcPr>
+          <w:p>
+            <w:r>
+              <w:rPr>
+                <w:b w:val="0"/>
+                <w:sz w:val="18"/>
+              </w:rPr>
+              <w:t>Is it safe to manufacture and will it stay environmentally contained?</w:t>
+            </w:r>
+          </w:p>
+        </w:tc>
+        <w:tc>
+          <w:tcPr>
+            <w:tcW w:type="dxa" w:w="1560"/>
+          </w:tcPr>
+          <w:p>
+            <w:r>
+              <w:rPr>
+                <w:b w:val="0"/>
+                <w:sz w:val="18"/>
+              </w:rPr>
+              <w:t>HGT composite score; GC content; Codon Adaptation Index (CAI)</w:t>
+            </w:r>
+          </w:p>
+        </w:tc>
+        <w:tc>
+          <w:tcPr>
+            <w:tcW w:type="dxa" w:w="1560"/>
+          </w:tcPr>
+          <w:p>
+            <w:r>
+              <w:rPr>
+                <w:b w:val="0"/>
+                <w:sz w:val="18"/>
+              </w:rPr>
+              <w:t>HGT 3.28/100; GC 0.530; CAI 1.000</w:t>
+            </w:r>
+          </w:p>
+        </w:tc>
+        <w:tc>
+          <w:tcPr>
+            <w:tcW w:type="dxa" w:w="1560"/>
+          </w:tcPr>
+          <w:p>
+            <w:r>
+              <w:rPr>
+                <w:b w:val="0"/>
+                <w:sz w:val="18"/>
+              </w:rPr>
+              <w:t>FAIL if HGT ≥ 50. Score 3.28 = negligible gene-transfer risk. GC 0.530 within normal E. coli range. CAI 1.000 = maximum E. coli expression efficiency.</w:t>
+            </w:r>
+          </w:p>
+        </w:tc>
+        <w:tc>
+          <w:tcPr>
+            <w:tcW w:type="dxa" w:w="1560"/>
+            <w:shd w:val="clear" w:color="auto" w:fill="E2EFDA"/>
+          </w:tcPr>
+          <w:p>
+            <w:r>
+              <w:rPr>
+                <w:b/>
+                <w:sz w:val="18"/>
+              </w:rPr>
+              <w:t>PASS</w:t>
+            </w:r>
+          </w:p>
+        </w:tc>
+      </w:tr>
+      <w:tr>
+        <w:tc>
+          <w:tcPr>
+            <w:tcW w:type="dxa" w:w="1560"/>
+            <w:shd w:val="clear" w:color="auto" w:fill="F2F2F2"/>
+          </w:tcPr>
+          <w:p>
+            <w:r>
+              <w:rPr>
+                <w:b/>
+                <w:sz w:val="18"/>
+              </w:rPr>
+              <w:t>δ — Embedding similarity</w:t>
+            </w:r>
+          </w:p>
+        </w:tc>
+        <w:tc>
+          <w:tcPr>
+            <w:tcW w:type="dxa" w:w="1560"/>
+          </w:tcPr>
+          <w:p>
+            <w:r>
+              <w:rPr>
+                <w:b w:val="0"/>
+                <w:sz w:val="18"/>
+              </w:rPr>
+              <w:t>Does the protein act like something dangerous (functional mimicry)?</w:t>
+            </w:r>
+          </w:p>
+        </w:tc>
+        <w:tc>
+          <w:tcPr>
+            <w:tcW w:type="dxa" w:w="1560"/>
+          </w:tcPr>
+          <w:p>
+            <w:r>
+              <w:rPr>
+                <w:b w:val="0"/>
+                <w:sz w:val="18"/>
+              </w:rPr>
+              <w:t>Cosine similarity to dangerous-protein reference embeddings (ESM-2 650M)</w:t>
+            </w:r>
+          </w:p>
+        </w:tc>
+        <w:tc>
+          <w:tcPr>
+            <w:tcW w:type="dxa" w:w="1560"/>
+          </w:tcPr>
+          <w:p>
+            <w:r>
+              <w:rPr>
+                <w:b w:val="0"/>
+                <w:sz w:val="18"/>
+              </w:rPr>
+              <w:t>Not yet evaluated</w:t>
+            </w:r>
+          </w:p>
+        </w:tc>
+        <w:tc>
+          <w:tcPr>
+            <w:tcW w:type="dxa" w:w="1560"/>
+          </w:tcPr>
+          <w:p>
+            <w:r>
+              <w:rPr>
+                <w:b w:val="0"/>
+                <w:sz w:val="18"/>
+              </w:rPr>
+              <w:t>FAIL if cosine similarity ≥ 25% to any reference hazard class. Gate under active development; deployment planned for Phase 6.</w:t>
+            </w:r>
+          </w:p>
+        </w:tc>
+        <w:tc>
+          <w:tcPr>
+            <w:tcW w:type="dxa" w:w="1560"/>
+            <w:shd w:val="clear" w:color="auto" w:fill="FFF2CC"/>
+          </w:tcPr>
+          <w:p>
+            <w:r>
+              <w:rPr>
+                <w:b/>
+                <w:sz w:val="18"/>
+              </w:rPr>
+              <w:t>PENDING (pre-production)</w:t>
+            </w:r>
+          </w:p>
+        </w:tc>
+      </w:tr>
+    </w:tbl>
     <w:p>
       <w:pPr>
         <w:spacing w:after="160" w:line="360" w:lineRule="auto"/>

</xml_diff>

<commit_message>
paper: add Table 4 — biosafety gate results for 7M5T demo submission (#46)
Inserts a six-column summary table after the Section 4.3 gate result
paragraphs, covering gates α–δ with question answered, key metrics,
actual values, thresholds/interpretation, and verdict. Gate δ clearly
marked PENDING (pre-production).

https://claude.ai/code/session_01E7HryiScK5iRY9dxXKUJWQ

Co-authored-by: Claude <noreply@anthropic.com>
</commit_message>
<xml_diff>
--- a/paper/ArtGene_Archive_bioRxiv_REVISED.docx
+++ b/paper/ArtGene_Archive_bioRxiv_REVISED.docx
@@ -6396,6 +6396,483 @@
         </w:rPr>
       </w:r>
     </w:p>
+    <w:p>
+      <w:r>
+        <w:rPr>
+          <w:i/>
+          <w:sz w:val="18"/>
+        </w:rPr>
+        <w:t>Table 4. Biosafety gate results for the demonstration submission (PDB 7M5T, de novo hallucinated protein 0515, Anishchenko et al. [30]). HGT = horizontal gene transfer propensity; GRAVY = grand average of hydropathicity; CAI = codon adaptation index; pLDDT = predicted local distance difference test.</w:t>
+      </w:r>
+    </w:p>
+    <w:tbl>
+      <w:tblPr>
+        <w:tblW w:type="auto" w:w="0"/>
+        <w:tblLook w:firstColumn="1" w:firstRow="1" w:lastColumn="0" w:lastRow="0" w:noHBand="0" w:noVBand="1" w:val="04A0"/>
+        <w:tblBorders>
+          <w:top w:val="single" w:sz="4" w:space="0" w:color="999999"/>
+          <w:left w:val="single" w:sz="4" w:space="0" w:color="999999"/>
+          <w:bottom w:val="single" w:sz="4" w:space="0" w:color="999999"/>
+          <w:right w:val="single" w:sz="4" w:space="0" w:color="999999"/>
+          <w:insideH w:val="single" w:sz="4" w:space="0" w:color="999999"/>
+          <w:insideV w:val="single" w:sz="4" w:space="0" w:color="999999"/>
+        </w:tblBorders>
+      </w:tblPr>
+      <w:tblGrid>
+        <w:gridCol w:w="1560"/>
+        <w:gridCol w:w="1560"/>
+        <w:gridCol w:w="1560"/>
+        <w:gridCol w:w="1560"/>
+        <w:gridCol w:w="1560"/>
+        <w:gridCol w:w="1560"/>
+      </w:tblGrid>
+      <w:tr>
+        <w:tc>
+          <w:tcPr>
+            <w:tcW w:type="dxa" w:w="1560"/>
+            <w:shd w:val="clear" w:color="auto" w:fill="D9E1F2"/>
+          </w:tcPr>
+          <w:p>
+            <w:r>
+              <w:rPr>
+                <w:b/>
+                <w:sz w:val="18"/>
+              </w:rPr>
+              <w:t>Gate</w:t>
+            </w:r>
+          </w:p>
+        </w:tc>
+        <w:tc>
+          <w:tcPr>
+            <w:tcW w:type="dxa" w:w="1560"/>
+            <w:shd w:val="clear" w:color="auto" w:fill="D9E1F2"/>
+          </w:tcPr>
+          <w:p>
+            <w:r>
+              <w:rPr>
+                <w:b/>
+                <w:sz w:val="18"/>
+              </w:rPr>
+              <w:t>Question answered</w:t>
+            </w:r>
+          </w:p>
+        </w:tc>
+        <w:tc>
+          <w:tcPr>
+            <w:tcW w:type="dxa" w:w="1560"/>
+            <w:shd w:val="clear" w:color="auto" w:fill="D9E1F2"/>
+          </w:tcPr>
+          <w:p>
+            <w:r>
+              <w:rPr>
+                <w:b/>
+                <w:sz w:val="18"/>
+              </w:rPr>
+              <w:t>Key metric(s)</w:t>
+            </w:r>
+          </w:p>
+        </w:tc>
+        <w:tc>
+          <w:tcPr>
+            <w:tcW w:type="dxa" w:w="1560"/>
+            <w:shd w:val="clear" w:color="auto" w:fill="D9E1F2"/>
+          </w:tcPr>
+          <w:p>
+            <w:r>
+              <w:rPr>
+                <w:b/>
+                <w:sz w:val="18"/>
+              </w:rPr>
+              <w:t>Value</w:t>
+              <w:br/>
+              <w:t>(7M5T demo)</w:t>
+            </w:r>
+          </w:p>
+        </w:tc>
+        <w:tc>
+          <w:tcPr>
+            <w:tcW w:type="dxa" w:w="1560"/>
+            <w:shd w:val="clear" w:color="auto" w:fill="D9E1F2"/>
+          </w:tcPr>
+          <w:p>
+            <w:r>
+              <w:rPr>
+                <w:b/>
+                <w:sz w:val="18"/>
+              </w:rPr>
+              <w:t>Threshold / interpretation</w:t>
+            </w:r>
+          </w:p>
+        </w:tc>
+        <w:tc>
+          <w:tcPr>
+            <w:tcW w:type="dxa" w:w="1560"/>
+            <w:shd w:val="clear" w:color="auto" w:fill="D9E1F2"/>
+          </w:tcPr>
+          <w:p>
+            <w:r>
+              <w:rPr>
+                <w:b/>
+                <w:sz w:val="18"/>
+              </w:rPr>
+              <w:t>Verdict</w:t>
+            </w:r>
+          </w:p>
+        </w:tc>
+      </w:tr>
+      <w:tr>
+        <w:tc>
+          <w:tcPr>
+            <w:tcW w:type="dxa" w:w="1560"/>
+            <w:shd w:val="clear" w:color="auto" w:fill="F2F2F2"/>
+          </w:tcPr>
+          <w:p>
+            <w:r>
+              <w:rPr>
+                <w:b/>
+                <w:sz w:val="18"/>
+              </w:rPr>
+              <w:t>α — Structural confidence</w:t>
+            </w:r>
+          </w:p>
+        </w:tc>
+        <w:tc>
+          <w:tcPr>
+            <w:tcW w:type="dxa" w:w="1560"/>
+          </w:tcPr>
+          <w:p>
+            <w:r>
+              <w:rPr>
+                <w:b w:val="0"/>
+                <w:sz w:val="18"/>
+              </w:rPr>
+              <w:t>Does the protein fold into a stable 3D structure?</w:t>
+            </w:r>
+          </w:p>
+        </w:tc>
+        <w:tc>
+          <w:tcPr>
+            <w:tcW w:type="dxa" w:w="1560"/>
+          </w:tcPr>
+          <w:p>
+            <w:r>
+              <w:rPr>
+                <w:b w:val="0"/>
+                <w:sz w:val="18"/>
+              </w:rPr>
+              <w:t>ESMFold pLDDT mean; fraction of residues pLDDT &lt; 50</w:t>
+            </w:r>
+          </w:p>
+        </w:tc>
+        <w:tc>
+          <w:tcPr>
+            <w:tcW w:type="dxa" w:w="1560"/>
+          </w:tcPr>
+          <w:p>
+            <w:r>
+              <w:rPr>
+                <w:b w:val="0"/>
+                <w:sz w:val="18"/>
+              </w:rPr>
+              <w:t>Mean 77.6; 0.0% below pLDDT 50</w:t>
+            </w:r>
+          </w:p>
+        </w:tc>
+        <w:tc>
+          <w:tcPr>
+            <w:tcW w:type="dxa" w:w="1560"/>
+          </w:tcPr>
+          <w:p>
+            <w:r>
+              <w:rPr>
+                <w:b w:val="0"/>
+                <w:sz w:val="18"/>
+              </w:rPr>
+              <w:t>FAIL if &gt; 20% residues below pLDDT 50. Score of 77.6 is good confidence; 0% disordered residues.</w:t>
+            </w:r>
+          </w:p>
+        </w:tc>
+        <w:tc>
+          <w:tcPr>
+            <w:tcW w:type="dxa" w:w="1560"/>
+            <w:shd w:val="clear" w:color="auto" w:fill="E2EFDA"/>
+          </w:tcPr>
+          <w:p>
+            <w:r>
+              <w:rPr>
+                <w:b/>
+                <w:sz w:val="18"/>
+              </w:rPr>
+              <w:t>PASS</w:t>
+            </w:r>
+          </w:p>
+        </w:tc>
+      </w:tr>
+      <w:tr>
+        <w:tc>
+          <w:tcPr>
+            <w:tcW w:type="dxa" w:w="1560"/>
+            <w:shd w:val="clear" w:color="auto" w:fill="F2F2F2"/>
+          </w:tcPr>
+          <w:p>
+            <w:r>
+              <w:rPr>
+                <w:b/>
+                <w:sz w:val="18"/>
+              </w:rPr>
+              <w:t>β — Off-target &amp; composition</w:t>
+            </w:r>
+          </w:p>
+        </w:tc>
+        <w:tc>
+          <w:tcPr>
+            <w:tcW w:type="dxa" w:w="1560"/>
+          </w:tcPr>
+          <w:p>
+            <w:r>
+              <w:rPr>
+                <w:b w:val="0"/>
+                <w:sz w:val="18"/>
+              </w:rPr>
+              <w:t>Could the protein harm a human (toxin or allergen)?</w:t>
+            </w:r>
+          </w:p>
+        </w:tc>
+        <w:tc>
+          <w:tcPr>
+            <w:tcW w:type="dxa" w:w="1560"/>
+          </w:tcPr>
+          <w:p>
+            <w:r>
+              <w:rPr>
+                <w:b w:val="0"/>
+                <w:sz w:val="18"/>
+              </w:rPr>
+              <w:t>GRAVY hydropathy; cationic toxin probability; allergen probability</w:t>
+            </w:r>
+          </w:p>
+        </w:tc>
+        <w:tc>
+          <w:tcPr>
+            <w:tcW w:type="dxa" w:w="1560"/>
+          </w:tcPr>
+          <w:p>
+            <w:r>
+              <w:rPr>
+                <w:b w:val="0"/>
+                <w:sz w:val="18"/>
+              </w:rPr>
+              <w:t>GRAVY −0.667; toxin prob 0.130; allergen prob 0.000</w:t>
+            </w:r>
+          </w:p>
+        </w:tc>
+        <w:tc>
+          <w:tcPr>
+            <w:tcW w:type="dxa" w:w="1560"/>
+          </w:tcPr>
+          <w:p>
+            <w:r>
+              <w:rPr>
+                <w:b w:val="0"/>
+                <w:sz w:val="18"/>
+              </w:rPr>
+              <w:t>GRAVY &lt; 0 = hydrophilic (not membrane-disrupting). Toxin threshold &lt; 0.30; allergen threshold &lt; 0.40. All within safe limits.</w:t>
+            </w:r>
+          </w:p>
+        </w:tc>
+        <w:tc>
+          <w:tcPr>
+            <w:tcW w:type="dxa" w:w="1560"/>
+            <w:shd w:val="clear" w:color="auto" w:fill="E2EFDA"/>
+          </w:tcPr>
+          <w:p>
+            <w:r>
+              <w:rPr>
+                <w:b/>
+                <w:sz w:val="18"/>
+              </w:rPr>
+              <w:t>PASS</w:t>
+            </w:r>
+          </w:p>
+        </w:tc>
+      </w:tr>
+      <w:tr>
+        <w:tc>
+          <w:tcPr>
+            <w:tcW w:type="dxa" w:w="1560"/>
+            <w:shd w:val="clear" w:color="auto" w:fill="F2F2F2"/>
+          </w:tcPr>
+          <w:p>
+            <w:r>
+              <w:rPr>
+                <w:b/>
+                <w:sz w:val="18"/>
+              </w:rPr>
+              <w:t>γ — Ecological risk</w:t>
+            </w:r>
+          </w:p>
+        </w:tc>
+        <w:tc>
+          <w:tcPr>
+            <w:tcW w:type="dxa" w:w="1560"/>
+          </w:tcPr>
+          <w:p>
+            <w:r>
+              <w:rPr>
+                <w:b w:val="0"/>
+                <w:sz w:val="18"/>
+              </w:rPr>
+              <w:t>Is it safe to manufacture and will it stay environmentally contained?</w:t>
+            </w:r>
+          </w:p>
+        </w:tc>
+        <w:tc>
+          <w:tcPr>
+            <w:tcW w:type="dxa" w:w="1560"/>
+          </w:tcPr>
+          <w:p>
+            <w:r>
+              <w:rPr>
+                <w:b w:val="0"/>
+                <w:sz w:val="18"/>
+              </w:rPr>
+              <w:t>HGT composite score; GC content; Codon Adaptation Index (CAI)</w:t>
+            </w:r>
+          </w:p>
+        </w:tc>
+        <w:tc>
+          <w:tcPr>
+            <w:tcW w:type="dxa" w:w="1560"/>
+          </w:tcPr>
+          <w:p>
+            <w:r>
+              <w:rPr>
+                <w:b w:val="0"/>
+                <w:sz w:val="18"/>
+              </w:rPr>
+              <w:t>HGT 3.28/100; GC 0.530; CAI 1.000</w:t>
+            </w:r>
+          </w:p>
+        </w:tc>
+        <w:tc>
+          <w:tcPr>
+            <w:tcW w:type="dxa" w:w="1560"/>
+          </w:tcPr>
+          <w:p>
+            <w:r>
+              <w:rPr>
+                <w:b w:val="0"/>
+                <w:sz w:val="18"/>
+              </w:rPr>
+              <w:t>FAIL if HGT ≥ 50. Score 3.28 = negligible gene-transfer risk. GC 0.530 within normal E. coli range. CAI 1.000 = maximum E. coli expression efficiency.</w:t>
+            </w:r>
+          </w:p>
+        </w:tc>
+        <w:tc>
+          <w:tcPr>
+            <w:tcW w:type="dxa" w:w="1560"/>
+            <w:shd w:val="clear" w:color="auto" w:fill="E2EFDA"/>
+          </w:tcPr>
+          <w:p>
+            <w:r>
+              <w:rPr>
+                <w:b/>
+                <w:sz w:val="18"/>
+              </w:rPr>
+              <w:t>PASS</w:t>
+            </w:r>
+          </w:p>
+        </w:tc>
+      </w:tr>
+      <w:tr>
+        <w:tc>
+          <w:tcPr>
+            <w:tcW w:type="dxa" w:w="1560"/>
+            <w:shd w:val="clear" w:color="auto" w:fill="F2F2F2"/>
+          </w:tcPr>
+          <w:p>
+            <w:r>
+              <w:rPr>
+                <w:b/>
+                <w:sz w:val="18"/>
+              </w:rPr>
+              <w:t>δ — Embedding similarity</w:t>
+            </w:r>
+          </w:p>
+        </w:tc>
+        <w:tc>
+          <w:tcPr>
+            <w:tcW w:type="dxa" w:w="1560"/>
+          </w:tcPr>
+          <w:p>
+            <w:r>
+              <w:rPr>
+                <w:b w:val="0"/>
+                <w:sz w:val="18"/>
+              </w:rPr>
+              <w:t>Does the protein act like something dangerous (functional mimicry)?</w:t>
+            </w:r>
+          </w:p>
+        </w:tc>
+        <w:tc>
+          <w:tcPr>
+            <w:tcW w:type="dxa" w:w="1560"/>
+          </w:tcPr>
+          <w:p>
+            <w:r>
+              <w:rPr>
+                <w:b w:val="0"/>
+                <w:sz w:val="18"/>
+              </w:rPr>
+              <w:t>Cosine similarity to dangerous-protein reference embeddings (ESM-2 650M)</w:t>
+            </w:r>
+          </w:p>
+        </w:tc>
+        <w:tc>
+          <w:tcPr>
+            <w:tcW w:type="dxa" w:w="1560"/>
+          </w:tcPr>
+          <w:p>
+            <w:r>
+              <w:rPr>
+                <w:b w:val="0"/>
+                <w:sz w:val="18"/>
+              </w:rPr>
+              <w:t>Not yet evaluated</w:t>
+            </w:r>
+          </w:p>
+        </w:tc>
+        <w:tc>
+          <w:tcPr>
+            <w:tcW w:type="dxa" w:w="1560"/>
+          </w:tcPr>
+          <w:p>
+            <w:r>
+              <w:rPr>
+                <w:b w:val="0"/>
+                <w:sz w:val="18"/>
+              </w:rPr>
+              <w:t>FAIL if cosine similarity ≥ 25% to any reference hazard class. Gate under active development; deployment planned for Phase 6.</w:t>
+            </w:r>
+          </w:p>
+        </w:tc>
+        <w:tc>
+          <w:tcPr>
+            <w:tcW w:type="dxa" w:w="1560"/>
+            <w:shd w:val="clear" w:color="auto" w:fill="FFF2CC"/>
+          </w:tcPr>
+          <w:p>
+            <w:r>
+              <w:rPr>
+                <w:b/>
+                <w:sz w:val="18"/>
+              </w:rPr>
+              <w:t>PENDING (pre-production)</w:t>
+            </w:r>
+          </w:p>
+        </w:tc>
+      </w:tr>
+    </w:tbl>
     <w:p>
       <w:pPr>
         <w:spacing w:after="160" w:line="360" w:lineRule="auto"/>

</xml_diff>